<commit_message>
Update CLAUDE.md and its Word copy to prd-2.md
Seven features and story items (1)-(24); adds rules for meal timing,
the Daily Health Score (50/30/20 with bedtime bands), family and friend
groups, and updated visibility; out of scope now lists Inventory.

Co-Authored-By: Claude Opus 5.5 <noreply@anthropic.com>
</commit_message>
<xml_diff>
--- a/07_DietGroceryApp/Claude-md-file.docx
+++ b/07_DietGroceryApp/Claude-md-file.docx
@@ -12,7 +12,7 @@
     </w:p>
     <w:p>
       <w:r>
-        <w:t xml:space="preserve">Sample CLAUDE.md drafted from prd-1.md (October 16, 2026, 15:27 version). Rename to CLAUDE.md in the app's code repo to activate it.</w:t>
+        <w:t xml:space="preserve">Drafted from prd-2.md (Oct 20, 2026, 18:13 version).</w:t>
       </w:r>
     </w:p>
     <w:p>
@@ -34,7 +34,7 @@
         <w:t xml:space="preserve">longevity eaters</w:t>
       </w:r>
       <w:r>
-        <w:t xml:space="preserve">: US adults (18+) who want to eat healthy every day to lose weight, maintain weight, gain muscle, or live longer. This includes dieters and GLP-1 users. The app turns a user's health statistics and food preferences into recipes, puts the groceries for those recipes into a cart (filled by an AI agent), and supports eating out on days the user doesn't cook.</w:t>
+        <w:t xml:space="preserve">: US adults (18+) who want to eat healthy every day to lose weight, maintain weight, gain muscle, or live longer. This includes dieters and GLP-1 users. The app turns a user's health statistics and food preferences into recipes, tells them when to eat, puts the groceries for those recipes into a cart (filled by an AI agent), supports eating out on days the user doesn't cook, and gives them a Daily Health Score they can share with family and friends.</w:t>
       </w:r>
     </w:p>
     <w:p>
@@ -45,7 +45,7 @@
         <w:rPr>
           <w:rFonts w:ascii="Consolas" w:hAnsi="Consolas"/>
         </w:rPr>
-        <w:t xml:space="preserve">prd-1.md</w:t>
+        <w:t xml:space="preserve">prd-2.md</w:t>
       </w:r>
       <w:r>
         <w:t xml:space="preserve">. When this file and the PRD disagree, the PRD wins. Tell me about the conflict rather than picking one silently.</w:t>
@@ -70,7 +70,7 @@
         <w:rPr>
           <w:b/>
         </w:rPr>
-        <w:t xml:space="preserve">Story items (1)–(22)</w:t>
+        <w:t xml:space="preserve">Story items (1)–(24)</w:t>
       </w:r>
       <w:r>
         <w:t xml:space="preserve"> are the numbered items in the PRD's core user story. Refer to them by number in code comments, commit messages and tests (e.g. </w:t>
@@ -79,7 +79,7 @@
         <w:rPr>
           <w:rFonts w:ascii="Consolas" w:hAnsi="Consolas"/>
         </w:rPr>
-        <w:t xml:space="preserve">story-20</w:t>
+        <w:t xml:space="preserve">story-21</w:t>
       </w:r>
       <w:r>
         <w:t xml:space="preserve">).</w:t>
@@ -96,10 +96,27 @@
         <w:rPr>
           <w:b/>
         </w:rPr>
+        <w:t xml:space="preserve">When to eat</w:t>
+      </w:r>
+      <w:r>
+        <w:t xml:space="preserve"> = story (10), the meal-timing alerts.</w:t>
+      </w:r>
+    </w:p>
+    <w:p>
+      <w:pPr>
+        <w:numPr>
+          <w:ilvl w:val="0"/>
+          <w:numId w:val="1"/>
+        </w:numPr>
+      </w:pPr>
+      <w:r>
+        <w:rPr>
+          <w:b/>
+        </w:rPr>
         <w:t xml:space="preserve">Daily audit</w:t>
       </w:r>
       <w:r>
-        <w:t xml:space="preserve"> = story (20), the End of Day Daily Confirmation Audit.</w:t>
+        <w:t xml:space="preserve"> = story (21), the End of Day Daily Confirmation Audit.</w:t>
       </w:r>
     </w:p>
     <w:p>
@@ -116,7 +133,41 @@
         <w:t xml:space="preserve">User Health Report</w:t>
       </w:r>
       <w:r>
-        <w:t xml:space="preserve"> = story (22) / Feature 6, the PDF export.</w:t>
+        <w:t xml:space="preserve"> = story (23) / Feature 6, the PDF export.</w:t>
+      </w:r>
+    </w:p>
+    <w:p>
+      <w:pPr>
+        <w:numPr>
+          <w:ilvl w:val="0"/>
+          <w:numId w:val="1"/>
+        </w:numPr>
+      </w:pPr>
+      <w:r>
+        <w:rPr>
+          <w:b/>
+        </w:rPr>
+        <w:t xml:space="preserve">Groups</w:t>
+      </w:r>
+      <w:r>
+        <w:t xml:space="preserve"> = story (24), family and/or friend groups.</w:t>
+      </w:r>
+    </w:p>
+    <w:p>
+      <w:pPr>
+        <w:numPr>
+          <w:ilvl w:val="0"/>
+          <w:numId w:val="1"/>
+        </w:numPr>
+      </w:pPr>
+      <w:r>
+        <w:rPr>
+          <w:b/>
+        </w:rPr>
+        <w:t xml:space="preserve">Daily Health Score</w:t>
+      </w:r>
+      <w:r>
+        <w:t xml:space="preserve"> = the 0–100 score shown after each daily audit (Feature 7).</w:t>
       </w:r>
     </w:p>
     <w:p>
@@ -152,7 +203,7 @@
         <w:pStyle w:val="Heading1"/>
       </w:pPr>
       <w:r>
-        <w:t xml:space="preserve">The six features (v1 scope)</w:t>
+        <w:t xml:space="preserve">The seven features (v1 scope)</w:t>
       </w:r>
     </w:p>
     <w:p>
@@ -180,7 +231,7 @@
         <w:t xml:space="preserve">Onboarding form.</w:t>
       </w:r>
       <w:r>
-        <w:t xml:space="preserve"> Collects health statistics (height, weight, BMI, BMR, muscle mass, visceral fat, GLP-1 dosage, optional InBody figures), diet goal, diet choice, preferred foods, excluded foods, workout plan and pantry contents. BMI and BMR can be typed in or calculated by the app. InBody data is optional.</w:t>
+        <w:t xml:space="preserve"> Collects health statistics (height, weight, BMI, BMR, muscle mass, visceral fat, GLP-1 dosage, optional InBody figures), diet goal, diet choice, preferred foods, excluded foods, workout plan, pantry contents, wake time, bed time, meal counts, and family and/or friends. BMI and BMR can be typed in or calculated by the app. InBody data is optional.</w:t>
       </w:r>
     </w:p>
     <w:p>
@@ -219,10 +270,10 @@
         <w:rPr>
           <w:b/>
         </w:rPr>
-        <w:t xml:space="preserve">Story items (10)–(20).</w:t>
-      </w:r>
-      <w:r>
-        <w:t xml:space="preserve"> Restaurant menu reading and 3 healthier options, consumption learning, workout education, tracking and plan, gamification, daily quotes, longevity doctor contact, and the daily audit.</w:t>
+        <w:t xml:space="preserve">Story items (10)–(21).</w:t>
+      </w:r>
+      <w:r>
+        <w:t xml:space="preserve"> When-to-eat alerts, restaurant menu reading and 3 healthier options, consumption learning, workout education, tracking and plan, gamification, daily quotes, longevity doctor contact, and the daily audit.</w:t>
       </w:r>
     </w:p>
     <w:p>
@@ -236,7 +287,7 @@
         <w:t xml:space="preserve">Recommendations.</w:t>
       </w:r>
       <w:r>
-        <w:t xml:space="preserve"> Daily per-user recommendations and weekly all-user recommendations for story items (1)–(18), plus a next-morning message naming the top-10% avatar names and their choices.</w:t>
+        <w:t xml:space="preserve"> Daily per-user recommendations and weekly all-user recommendations for story items (1)–(19), plus a next-morning message naming the top-10% avatar names and their choices.</w:t>
       </w:r>
     </w:p>
     <w:p>
@@ -250,7 +301,21 @@
         <w:t xml:space="preserve">User Health Report.</w:t>
       </w:r>
       <w:r>
-        <w:t xml:space="preserve"> A PDF of health statistics plus story items (1)–(7), (10)–(11), (14)–(16) and (20), which the user can print or email.</w:t>
+        <w:t xml:space="preserve"> A PDF of health statistics plus story items (1)–(7), (10)–(12), (15)–(17) and (21), which the user can print or email.</w:t>
+      </w:r>
+    </w:p>
+    <w:p>
+      <w:r>
+        <w:t xml:space="preserve">7. </w:t>
+      </w:r>
+      <w:r>
+        <w:rPr>
+          <w:b/>
+        </w:rPr>
+        <w:t xml:space="preserve">Daily Health Score.</w:t>
+      </w:r>
+      <w:r>
+        <w:t xml:space="preserve"> Tracked daily, weekly and monthly, shareable with the user's family and/or friend groups, and comparable against the top 10% or the user's groups.</w:t>
       </w:r>
     </w:p>
     <w:p>
@@ -375,6 +440,373 @@
         <w:pStyle w:val="Heading2"/>
       </w:pPr>
       <w:r>
+        <w:t xml:space="preserve">When to eat</w:t>
+      </w:r>
+    </w:p>
+    <w:p>
+      <w:pPr>
+        <w:numPr>
+          <w:ilvl w:val="0"/>
+          <w:numId w:val="1"/>
+        </w:numPr>
+      </w:pPr>
+      <w:r>
+        <w:t xml:space="preserve">Default: 6 eating times a day, one every 3 hours, in this order: meal 1, snack 1, meal 2, snack 2, meal 3, snack 3.</w:t>
+      </w:r>
+    </w:p>
+    <w:p>
+      <w:pPr>
+        <w:numPr>
+          <w:ilvl w:val="0"/>
+          <w:numId w:val="1"/>
+        </w:numPr>
+      </w:pPr>
+      <w:r>
+        <w:t xml:space="preserve">GLP-1 and intermittent fasting users default to </w:t>
+      </w:r>
+      <w:r>
+        <w:rPr>
+          <w:b/>
+        </w:rPr>
+        <w:t xml:space="preserve">3 meals and 0 snacks</w:t>
+      </w:r>
+      <w:r>
+        <w:t xml:space="preserve">, set at onboarding and changeable any time.</w:t>
+      </w:r>
+    </w:p>
+    <w:p>
+      <w:pPr>
+        <w:numPr>
+          <w:ilvl w:val="0"/>
+          <w:numId w:val="1"/>
+        </w:numPr>
+      </w:pPr>
+      <w:r>
+        <w:t xml:space="preserve">Any user can choose more or fewer than 6. Space their meals </w:t>
+      </w:r>
+      <w:r>
+        <w:rPr>
+          <w:b/>
+        </w:rPr>
+        <w:t xml:space="preserve">evenly</w:t>
+      </w:r>
+      <w:r>
+        <w:t xml:space="preserve"> through the day.</w:t>
+      </w:r>
+    </w:p>
+    <w:p>
+      <w:pPr>
+        <w:numPr>
+          <w:ilvl w:val="0"/>
+          <w:numId w:val="1"/>
+        </w:numPr>
+      </w:pPr>
+      <w:r>
+        <w:t xml:space="preserve">The last meal must be </w:t>
+      </w:r>
+      <w:r>
+        <w:rPr>
+          <w:b/>
+        </w:rPr>
+        <w:t xml:space="preserve">3 hours before bedtime</w:t>
+      </w:r>
+      <w:r>
+        <w:t xml:space="preserve">.</w:t>
+      </w:r>
+    </w:p>
+    <w:p>
+      <w:pPr>
+        <w:numPr>
+          <w:ilvl w:val="0"/>
+          <w:numId w:val="1"/>
+        </w:numPr>
+      </w:pPr>
+      <w:r>
+        <w:t xml:space="preserve">The user enters expected wake and bed times at onboarding and can change them in the daily audit, where they also confirm their last meal.</w:t>
+      </w:r>
+    </w:p>
+    <w:p>
+      <w:pPr>
+        <w:numPr>
+          <w:ilvl w:val="0"/>
+          <w:numId w:val="1"/>
+        </w:numPr>
+      </w:pPr>
+      <w:r>
+        <w:t xml:space="preserve">Tell the user when to eat with an </w:t>
+      </w:r>
+      <w:r>
+        <w:rPr>
+          <w:b/>
+        </w:rPr>
+        <w:t xml:space="preserve">alert</w:t>
+      </w:r>
+      <w:r>
+        <w:t xml:space="preserve">.</w:t>
+      </w:r>
+    </w:p>
+    <w:p>
+      <w:pPr>
+        <w:pStyle w:val="Heading2"/>
+      </w:pPr>
+      <w:r>
+        <w:t xml:space="preserve">Daily Health Score (0–100, given after each daily audit)</w:t>
+      </w:r>
+    </w:p>
+    <w:p>
+      <w:pPr>
+        <w:numPr>
+          <w:ilvl w:val="0"/>
+          <w:numId w:val="1"/>
+        </w:numPr>
+      </w:pPr>
+      <w:r>
+        <w:rPr>
+          <w:b/>
+        </w:rPr>
+        <w:t xml:space="preserve">Food, 50 points:</w:t>
+      </w:r>
+      <w:r>
+        <w:t xml:space="preserve"> the meals eaten compared to the recipe or restaurant meals chosen. Each meal and snack the user confirms with "yes" earns an equal share of the 50. The share recalculates if the user's meal count changes (e.g. 6 meals ≈ 8.33 each; 3 meals ≈ 16.67 each).</w:t>
+      </w:r>
+    </w:p>
+    <w:p>
+      <w:pPr>
+        <w:numPr>
+          <w:ilvl w:val="0"/>
+          <w:numId w:val="1"/>
+        </w:numPr>
+      </w:pPr>
+      <w:r>
+        <w:rPr>
+          <w:b/>
+        </w:rPr>
+        <w:t xml:space="preserve">Workout, 30 points:</w:t>
+      </w:r>
+      <w:r>
+        <w:t xml:space="preserve"> workout time done compared to the plan. Each cardio or free-weight session earns an equal share of the 30.</w:t>
+      </w:r>
+    </w:p>
+    <w:p>
+      <w:pPr>
+        <w:numPr>
+          <w:ilvl w:val="0"/>
+          <w:numId w:val="1"/>
+        </w:numPr>
+      </w:pPr>
+      <w:r>
+        <w:rPr>
+          <w:b/>
+        </w:rPr>
+        <w:t xml:space="preserve">Last meal before bed, 20 points</w:t>
+      </w:r>
+      <w:r>
+        <w:t xml:space="preserve">, by hours between the last meal and bedtime:</w:t>
+      </w:r>
+    </w:p>
+    <w:p>
+      <w:pPr>
+        <w:numPr>
+          <w:ilvl w:val="0"/>
+          <w:numId w:val="1"/>
+        </w:numPr>
+      </w:pPr>
+      <w:r>
+        <w:t xml:space="preserve">3 or more hours (including 3 to 2.91): 20</w:t>
+      </w:r>
+    </w:p>
+    <w:p>
+      <w:pPr>
+        <w:numPr>
+          <w:ilvl w:val="0"/>
+          <w:numId w:val="1"/>
+        </w:numPr>
+      </w:pPr>
+      <w:r>
+        <w:t xml:space="preserve">2.9 to 2.75: 17.5</w:t>
+      </w:r>
+    </w:p>
+    <w:p>
+      <w:pPr>
+        <w:numPr>
+          <w:ilvl w:val="0"/>
+          <w:numId w:val="1"/>
+        </w:numPr>
+      </w:pPr>
+      <w:r>
+        <w:t xml:space="preserve">2.74 to 2.5: 15</w:t>
+      </w:r>
+    </w:p>
+    <w:p>
+      <w:pPr>
+        <w:numPr>
+          <w:ilvl w:val="0"/>
+          <w:numId w:val="1"/>
+        </w:numPr>
+      </w:pPr>
+      <w:r>
+        <w:t xml:space="preserve">2.49 to 2.25: 12.5</w:t>
+      </w:r>
+    </w:p>
+    <w:p>
+      <w:pPr>
+        <w:numPr>
+          <w:ilvl w:val="0"/>
+          <w:numId w:val="1"/>
+        </w:numPr>
+      </w:pPr>
+      <w:r>
+        <w:t xml:space="preserve">2.24 to 2.0: 10</w:t>
+      </w:r>
+    </w:p>
+    <w:p>
+      <w:pPr>
+        <w:numPr>
+          <w:ilvl w:val="0"/>
+          <w:numId w:val="1"/>
+        </w:numPr>
+      </w:pPr>
+      <w:r>
+        <w:t xml:space="preserve">1.99 to 1.75: 7.5</w:t>
+      </w:r>
+    </w:p>
+    <w:p>
+      <w:pPr>
+        <w:numPr>
+          <w:ilvl w:val="0"/>
+          <w:numId w:val="1"/>
+        </w:numPr>
+      </w:pPr>
+      <w:r>
+        <w:t xml:space="preserve">1.74 to 1.5: 5</w:t>
+      </w:r>
+    </w:p>
+    <w:p>
+      <w:pPr>
+        <w:numPr>
+          <w:ilvl w:val="0"/>
+          <w:numId w:val="1"/>
+        </w:numPr>
+      </w:pPr>
+      <w:r>
+        <w:t xml:space="preserve">1.49 to 1.25: 2.5</w:t>
+      </w:r>
+    </w:p>
+    <w:p>
+      <w:pPr>
+        <w:numPr>
+          <w:ilvl w:val="0"/>
+          <w:numId w:val="1"/>
+        </w:numPr>
+      </w:pPr>
+      <w:r>
+        <w:t xml:space="preserve">1.24 or less: 0</w:t>
+      </w:r>
+    </w:p>
+    <w:p>
+      <w:pPr>
+        <w:numPr>
+          <w:ilvl w:val="0"/>
+          <w:numId w:val="1"/>
+        </w:numPr>
+      </w:pPr>
+      <w:r>
+        <w:t xml:space="preserve">Roll the score up daily, weekly and monthly.</w:t>
+      </w:r>
+    </w:p>
+    <w:p>
+      <w:pPr>
+        <w:pStyle w:val="Heading2"/>
+      </w:pPr>
+      <w:r>
+        <w:t xml:space="preserve">Groups (family and friends)</w:t>
+      </w:r>
+    </w:p>
+    <w:p>
+      <w:pPr>
+        <w:numPr>
+          <w:ilvl w:val="0"/>
+          <w:numId w:val="1"/>
+        </w:numPr>
+      </w:pPr>
+      <w:r>
+        <w:t xml:space="preserve">At onboarding a user can add people by their </w:t>
+      </w:r>
+      <w:r>
+        <w:rPr>
+          <w:b/>
+        </w:rPr>
+        <w:t xml:space="preserve">avatar name</w:t>
+      </w:r>
+      <w:r>
+        <w:t xml:space="preserve">. Later, they add people by sending a </w:t>
+      </w:r>
+      <w:r>
+        <w:rPr>
+          <w:b/>
+        </w:rPr>
+        <w:t xml:space="preserve">friend request</w:t>
+      </w:r>
+      <w:r>
+        <w:t xml:space="preserve">.</w:t>
+      </w:r>
+    </w:p>
+    <w:p>
+      <w:pPr>
+        <w:numPr>
+          <w:ilvl w:val="0"/>
+          <w:numId w:val="1"/>
+        </w:numPr>
+      </w:pPr>
+      <w:r>
+        <w:t xml:space="preserve">The other person </w:t>
+      </w:r>
+      <w:r>
+        <w:rPr>
+          <w:b/>
+        </w:rPr>
+        <w:t xml:space="preserve">must accept</w:t>
+      </w:r>
+      <w:r>
+        <w:t xml:space="preserve"> in both cases.</w:t>
+      </w:r>
+    </w:p>
+    <w:p>
+      <w:pPr>
+        <w:numPr>
+          <w:ilvl w:val="0"/>
+          <w:numId w:val="1"/>
+        </w:numPr>
+      </w:pPr>
+      <w:r>
+        <w:t xml:space="preserve">A user can be in </w:t>
+      </w:r>
+      <w:r>
+        <w:rPr>
+          <w:b/>
+        </w:rPr>
+        <w:t xml:space="preserve">more than one</w:t>
+      </w:r>
+      <w:r>
+        <w:t xml:space="preserve"> group.</w:t>
+      </w:r>
+    </w:p>
+    <w:p>
+      <w:pPr>
+        <w:numPr>
+          <w:ilvl w:val="0"/>
+          <w:numId w:val="1"/>
+        </w:numPr>
+      </w:pPr>
+      <w:r>
+        <w:t xml:space="preserve">Group members can see each other's avatar names and shared Daily Health Scores.</w:t>
+      </w:r>
+    </w:p>
+    <w:p>
+      <w:pPr>
+        <w:pStyle w:val="Heading2"/>
+      </w:pPr>
+      <w:r>
         <w:t xml:space="preserve">Avatar names and privacy</w:t>
       </w:r>
     </w:p>
@@ -417,7 +849,7 @@
         </w:numPr>
       </w:pPr>
       <w:r>
-        <w:t xml:space="preserve">Other users can see every avatar name. They can see top-10% users' choices, </w:t>
+        <w:t xml:space="preserve">Every user can see every avatar name. Everyone can see top-10% users' choices and Daily Health Scores, </w:t>
       </w:r>
       <w:r>
         <w:rPr>
@@ -437,18 +869,27 @@
         </w:numPr>
       </w:pPr>
       <w:r>
-        <w:t xml:space="preserve">Top-10% users cannot opt out of having their choices shown.</w:t>
-      </w:r>
-    </w:p>
-    <w:p>
-      <w:pPr>
-        <w:numPr>
-          <w:ilvl w:val="0"/>
-          <w:numId w:val="1"/>
-        </w:numPr>
-      </w:pPr>
-      <w:r>
-        <w:t xml:space="preserve">Cross-user data is combined only in deidentified form, keyed to avatar names. No one should be able to link an avatar name back to a real person.</w:t>
+        <w:t xml:space="preserve">Top-10% users cannot opt out of having their choices or Daily Health Score shown.</w:t>
+      </w:r>
+    </w:p>
+    <w:p>
+      <w:pPr>
+        <w:numPr>
+          <w:ilvl w:val="0"/>
+          <w:numId w:val="1"/>
+        </w:numPr>
+      </w:pPr>
+      <w:r>
+        <w:t xml:space="preserve">Cross-user data is combined only in deidentified form, keyed to avatar names. Users </w:t>
+      </w:r>
+      <w:r>
+        <w:rPr>
+          <w:b/>
+        </w:rPr>
+        <w:t xml:space="preserve">outside</w:t>
+      </w:r>
+      <w:r>
+        <w:t xml:space="preserve"> someone's groups must not be able to link that avatar name back to a real person.</w:t>
       </w:r>
     </w:p>
     <w:p>
@@ -691,8 +1132,42 @@
       </w:r>
     </w:p>
     <w:p>
-      <w:r>
-        <w:t xml:space="preserve">The PRD's out-of-scope list is currently empty. If a request seems to go beyond the six features above, ask before building it.</w:t>
+      <w:pPr>
+        <w:numPr>
+          <w:ilvl w:val="0"/>
+          <w:numId w:val="1"/>
+        </w:numPr>
+      </w:pPr>
+      <w:r>
+        <w:rPr>
+          <w:b/>
+        </w:rPr>
+        <w:t xml:space="preserve">Permanently:</w:t>
+      </w:r>
+      <w:r>
+        <w:t xml:space="preserve"> Inventory. HushPlate holds no food stock of its own. Every grocery item comes from a store, through the AI agent or the user's own shopping.</w:t>
+      </w:r>
+    </w:p>
+    <w:p>
+      <w:pPr>
+        <w:numPr>
+          <w:ilvl w:val="0"/>
+          <w:numId w:val="1"/>
+        </w:numPr>
+      </w:pPr>
+      <w:r>
+        <w:rPr>
+          <w:b/>
+        </w:rPr>
+        <w:t xml:space="preserve">Temporarily:</w:t>
+      </w:r>
+      <w:r>
+        <w:t xml:space="preserve"> nothing listed yet.</w:t>
+      </w:r>
+    </w:p>
+    <w:p>
+      <w:r>
+        <w:t xml:space="preserve">If a request seems to go beyond the seven features above, ask before building it.</w:t>
       </w:r>
     </w:p>
     <w:p>
@@ -714,7 +1189,7 @@
         <w:rPr>
           <w:rFonts w:ascii="Consolas" w:hAnsi="Consolas"/>
         </w:rPr>
-        <w:t xml:space="preserve">prd-1.md</w:t>
+        <w:t xml:space="preserve">prd-2.md</w:t>
       </w:r>
       <w:r>
         <w:t xml:space="preserve"> — the current product spec</w:t>
@@ -731,10 +1206,10 @@
         <w:rPr>
           <w:rFonts w:ascii="Consolas" w:hAnsi="Consolas"/>
         </w:rPr>
-        <w:t xml:space="preserve">strategy/spec-audit-1.md</w:t>
-      </w:r>
-      <w:r>
-        <w:t xml:space="preserve"> — plain description of what the spec commits to, plus open gaps</w:t>
+        <w:t xml:space="preserve">strategy/spec-audit-UPDATED.md</w:t>
+      </w:r>
+      <w:r>
+        <w:t xml:space="preserve"> — plain description of what prd-2.md commits to, plus open gaps</w:t>
       </w:r>
     </w:p>
     <w:p>
@@ -751,7 +1226,7 @@
         <w:t xml:space="preserve">strategy/moat-ranking.md</w:t>
       </w:r>
       <w:r>
-        <w:t xml:space="preserve"> — moat analysis</w:t>
+        <w:t xml:space="preserve"> — moat analysis (written against the older prd-1.md)</w:t>
       </w:r>
     </w:p>
     <w:p>
@@ -769,6 +1244,63 @@
       </w:r>
       <w:r>
         <w:t xml:space="preserve"> — nine-competitor teardown and complaint themes</w:t>
+      </w:r>
+    </w:p>
+    <w:p>
+      <w:pPr>
+        <w:pStyle w:val="Heading1"/>
+      </w:pPr>
+      <w:r>
+        <w:t xml:space="preserve">Rules</w:t>
+      </w:r>
+    </w:p>
+    <w:p>
+      <w:r>
+        <w:t xml:space="preserve">Explain changes in pain English. I am not a programmer.</w:t>
+      </w:r>
+    </w:p>
+    <w:p>
+      <w:pPr>
+        <w:numPr>
+          <w:ilvl w:val="0"/>
+          <w:numId w:val="1"/>
+        </w:numPr>
+      </w:pPr>
+      <w:r>
+        <w:t xml:space="preserve">Prefer the simplest solution that works.</w:t>
+      </w:r>
+    </w:p>
+    <w:p>
+      <w:pPr>
+        <w:numPr>
+          <w:ilvl w:val="0"/>
+          <w:numId w:val="1"/>
+        </w:numPr>
+      </w:pPr>
+      <w:r>
+        <w:t xml:space="preserve">Ask before adding any new service or library.</w:t>
+      </w:r>
+    </w:p>
+    <w:p>
+      <w:pPr>
+        <w:numPr>
+          <w:ilvl w:val="0"/>
+          <w:numId w:val="1"/>
+        </w:numPr>
+      </w:pPr>
+      <w:r>
+        <w:t xml:space="preserve">Commit automatically at the end of each phase. Don't ask, don't just remind.</w:t>
+      </w:r>
+    </w:p>
+    <w:p>
+      <w:pPr>
+        <w:numPr>
+          <w:ilvl w:val="0"/>
+          <w:numId w:val="1"/>
+        </w:numPr>
+      </w:pPr>
+      <w:r>
+        <w:t xml:space="preserve">Never leave the ENTP 6314 folder.</w:t>
       </w:r>
     </w:p>
     <w:sectPr>

</xml_diff>